<commit_message>
docs: Update Task 6 in report with OpenTripMap API details and add compiled PDF
</commit_message>
<xml_diff>
--- a/COS 221 Practical 5 Team 16.docx
+++ b/COS 221 Practical 5 Team 16.docx
@@ -508,10 +508,7 @@
         <w:rPr/>
       </w:pPr>
       <w:r>
-        <w:rPr>
-          <w:rtl w:val="0"/>
-        </w:rPr>
-        <w:t xml:space="preserve">Our group utilized a synthetic, dataset themed around the television shows Ted Lasso, Invincible, and The Boys. While the data is fictional, it mirrors the exact structure, constraints, and data types of real-world travel APIs (such as OpenTripMap or Amadeus) making it effective and sufficient to rigorously test our web application.</w:t>
+        <w:t>Our group integrated the real-world OpenTripMap API into our application to query real-world destinations, coordinates, lodging assets, dining spots, and points of interest. To ensure reliability and speed during marking, we implemented a hybrid data model: 1) Live OpenTripMap API Integration: Allows real-time geocoding and proximity-based queries of travel attractions, accommodations, and restaurants using cURL calls to OpenTripMap. 2) Fallback Local Cache: Includes a pre-populated cache for major global hubs (Cape Town, London, Paris, Rome, and Tokyo) to guarantee high-quality mock data when working offline or without active API keys. Additionally, we seeded a premium thematic dataset (themed around Ted Lasso, Invincible, and The Boys) to populate core databases. This structured data uses valid latitude and longitude ranges, features logical durations and pricing tiers (budget to luxury), and associated foreign keys that test our complex M:N table joins.</w:t>
       </w:r>
     </w:p>
     <w:p>

</xml_diff>

<commit_message>
docs: document extra features in docx report and recompile PDF
</commit_message>
<xml_diff>
--- a/COS 221 Practical 5 Team 16.docx
+++ b/COS 221 Practical 5 Team 16.docx
@@ -953,6 +953,99 @@
         <w:rPr>
           <w:rtl w:val="0"/>
         </w:rPr>
+      </w:r>
+    </w:p>
+    <w:p/>
+    <w:p>
+      <w:r>
+        <w:rPr>
+          <w:b/>
+        </w:rPr>
+        <w:t>2. Additional Premium Features Implemented:</w:t>
+      </w:r>
+    </w:p>
+    <w:p>
+      <w:r>
+        <w:t xml:space="preserve">·       </w:t>
+      </w:r>
+      <w:r>
+        <w:rPr>
+          <w:b/>
+        </w:rPr>
+        <w:t xml:space="preserve">Leaflet.js Interactive Flow Maps: </w:t>
+      </w:r>
+      <w:r>
+        <w:t>Itinerary views dynamically map and connect destinations, lodgings, dining spots, and attraction coordinates sequentially on a graphic Leaflet.js canvas, showing flight and land paths with popups.</w:t>
+      </w:r>
+    </w:p>
+    <w:p>
+      <w:r>
+        <w:t xml:space="preserve">·       </w:t>
+      </w:r>
+      <w:r>
+        <w:rPr>
+          <w:b/>
+        </w:rPr>
+        <w:t xml:space="preserve">Dedicated Travel Place API Search &amp; Quick-Add: </w:t>
+      </w:r>
+      <w:r>
+        <w:t>Designed a simplified travel place explorer to search and import cities and sights from the live OpenTripMap database with quick-add forms and image preview capabilities.</w:t>
+      </w:r>
+    </w:p>
+    <w:p>
+      <w:r>
+        <w:t xml:space="preserve">·       </w:t>
+      </w:r>
+      <w:r>
+        <w:rPr>
+          <w:b/>
+        </w:rPr>
+        <w:t xml:space="preserve">Interactive AJAX Asset Editing: </w:t>
+      </w:r>
+      <w:r>
+        <w:t>Implemented direct edit capabilities on hover inside the travel agency configuration checklists, allowing managers to modify names, costs, ratings, or custom image URLs instantly.</w:t>
+      </w:r>
+    </w:p>
+    <w:p>
+      <w:r>
+        <w:t xml:space="preserve">·       </w:t>
+      </w:r>
+      <w:r>
+        <w:rPr>
+          <w:b/>
+        </w:rPr>
+        <w:t xml:space="preserve">IP-Based Login Rate Limiting: </w:t>
+      </w:r>
+      <w:r>
+        <w:t>Built an automated security auditor tracking failed login attempts to lock out accounts after 5 failed tries, writing logs to a separate security_audit.log.</w:t>
+      </w:r>
+    </w:p>
+    <w:p>
+      <w:r>
+        <w:t xml:space="preserve">·       </w:t>
+      </w:r>
+      <w:r>
+        <w:rPr>
+          <w:b/>
+        </w:rPr>
+        <w:t xml:space="preserve">Live Async Notification Hub: </w:t>
+      </w:r>
+      <w:r>
+        <w:t>Periodic asynchronous polling checks for updates to bookings, payments, and reviews, popping up live visual notifications.</w:t>
+      </w:r>
+    </w:p>
+    <w:p>
+      <w:r>
+        <w:t xml:space="preserve">·       </w:t>
+      </w:r>
+      <w:r>
+        <w:rPr>
+          <w:b/>
+        </w:rPr>
+        <w:t xml:space="preserve">iCalendar Calendar Exporter: </w:t>
+      </w:r>
+      <w:r>
+        <w:t>One-click iCalendar sync utility generates RFC-5545 compliant .ics files for syncing travel itineraries directly to Google Calendar, Apple Calendar, and Outlook.</w:t>
       </w:r>
     </w:p>
     <w:sectPr>

</xml_diff>